<commit_message>
Add source credits to guides and downloads; link Kagan resources without reproducing templates
</commit_message>
<xml_diff>
--- a/retrieval-because-but-so-template.docx
+++ b/retrieval-because-but-so-template.docx
@@ -150,7 +150,7 @@
     <w:sectPr>
       <w:footerReference w:type="default" r:id="rId9"/>
       <w:pgSz w:w="12240" w:h="15840"/>
-      <w:pgMar w:top="864" w:right="936" w:bottom="864" w:left="936" w:header="720" w:footer="720" w:gutter="0"/>
+      <w:pgMar w:top="864" w:right="936" w:bottom="864" w:left="936" w:header="720" w:footer="346" w:gutter="0"/>
       <w:cols w:space="720"/>
       <w:docGrid w:linePitch="360"/>
     </w:sectPr>
@@ -163,13 +163,51 @@
   <w:p>
     <w:pPr>
       <w:pStyle w:val="Footer"/>
+      <w:spacing w:after="20" w:line="240" w:lineRule="auto"/>
     </w:pPr>
     <w:r>
       <w:rPr>
-        <w:sz w:val="18"/>
-      </w:rPr>
-      <w:t>Recall from memory first. Check and improve in a different colour.</w:t>
+        <w:rFonts w:ascii="Calibri" w:hAnsi="Calibri"/>
+        <w:color w:val="566663"/>
+        <w:sz w:val="16"/>
+      </w:rPr>
+      <w:t xml:space="preserve">Source: </w:t>
     </w:r>
+    <w:hyperlink r:id="rId1">
+      <w:r>
+        <w:rPr>
+          <w:rFonts w:ascii="Calibri" w:hAnsi="Calibri"/>
+          <w:sz w:val="16"/>
+          <w:color w:val="566663"/>
+          <w:u w:val="single"/>
+        </w:rPr>
+        <w:t>Judith C. Hochman &amp; Natalie Wexler — The Writing Revolution; Bradford Research School adaptation</w:t>
+      </w:r>
+    </w:hyperlink>
+  </w:p>
+  <w:p>
+    <w:pPr>
+      <w:spacing w:after="0" w:line="240" w:lineRule="auto"/>
+    </w:pPr>
+    <w:r>
+      <w:rPr>
+        <w:rFonts w:ascii="Calibri" w:hAnsi="Calibri"/>
+        <w:color w:val="566663"/>
+        <w:sz w:val="16"/>
+      </w:rPr>
+      <w:t xml:space="preserve">Independent classroom adaptation. </w:t>
+    </w:r>
+    <w:hyperlink r:id="rId2">
+      <w:r>
+        <w:rPr>
+          <w:rFonts w:ascii="Calibri" w:hAnsi="Calibri"/>
+          <w:sz w:val="16"/>
+          <w:color w:val="566663"/>
+          <w:u w:val="single"/>
+        </w:rPr>
+        <w:t>Activity guide and full credit</w:t>
+      </w:r>
+    </w:hyperlink>
   </w:p>
 </w:ftr>
 </file>

</xml_diff>